<commit_message>
fix analytics and overall view
</commit_message>
<xml_diff>
--- a/FFPRAMS_Use_Case_Corrected.docx
+++ b/FFPRAMS_Use_Case_Corrected.docx
@@ -5851,7 +5851,7 @@
               <w:t xml:space="preserve">Step 3: </w:t>
             </w:r>
             <w:r>
-              <w:t>User selects from the available report types: Beneficiaries per Barangay, Resource Distribution Summary, Distribution Status per Barangay, Unreached Beneficiaries, Monthly Distribution Summary, Financial Assistance Summary by Resource Type, Financial Assistance per Barangay, or Financial Assistance Distribution by Purpose.</w:t>
+              <w:t>User selects the report section tab and specific report to generate.</w:t>
             </w:r>
           </w:p>
           <w:p>
@@ -5863,7 +5863,7 @@
               <w:t xml:space="preserve">Step 4: </w:t>
             </w:r>
             <w:r>
-              <w:t>User exports the report in PDF or CSV (Excel-compatible) format.</w:t>
+              <w:t>User clicks the export button to download the report in PDF or Excel (CSV-compatible) format.</w:t>
             </w:r>
           </w:p>
           <w:p/>
@@ -5888,7 +5888,7 @@
               <w:t xml:space="preserve">System Response: </w:t>
             </w:r>
             <w:r>
-              <w:t>Displays the available report types.</w:t>
+              <w:t>Displays report section tabs and available report options.</w:t>
             </w:r>
           </w:p>
           <w:p>

</xml_diff>